<commit_message>
Update Pats paper with tab access protection and 46 regression checks
</commit_message>
<xml_diff>
--- a/paper-output/Pats_Test_Case_Documentation.docx
+++ b/paper-output/Pats_Test_Case_Documentation.docx
@@ -34,7 +34,7 @@
         <w:rPr>
           <w:sz w:val="20"/>
         </w:rPr>
-        <w:t xml:space="preserve">Completed Action Taken and Resolved entries for TC1-TC20, prepared for Pats on 15 October 2026. Reported fixes were implemented and 29 local regression checks passed. Existing tester OK values are retained and identified as results from the supplied PDF. Local checks used an isolated SQLite fixture, simulated email delivery, and headless Chrome; they do not establish deployed PostgreSQL behavior, actual inbox delivery, load capacity, cross-device compatibility, or user acceptance.</w:t>
+        <w:t xml:space="preserve">Completed Action Taken and Resolved entries for TC1-TC20, prepared for Pats on 15 October 2026. Reported fixes were implemented and 46 local regression checks passed. Existing tester OK values are retained and identified as results from the supplied PDF. Local checks used an isolated SQLite fixture, simulated email delivery, and headless Chrome; they do not establish deployed PostgreSQL behavior, actual inbox delivery, load capacity, cross-device compatibility, or user acceptance.</w:t>
       </w:r>
     </w:p>
     <w:p>
@@ -195,23 +195,23 @@
               <w:rPr>
                 <w:sz w:val="19"/>
               </w:rPr>
-              <w:t xml:space="preserve">Enabled SMTP verification-email delivery when no Brevo API key is configured, documented the HTTPS email configuration, and prevented a failed resend from invalidating an earlier code. Verified SMTP selection, OTP acceptance and rejection, and failed-resend recovery using isolated fixtures. The verification interface remains email-only; the obsolete mobile-number alternative was already removed. Actual inbox delivery still requires a deployed-service retest.</w:t>
-            </w:r>
-          </w:p>
-        </w:tc>
-        <w:tc>
-          <w:tcPr>
-            <w:tcW w:w="3800" w:type="dxa"/>
-          </w:tcPr>
-          <w:p>
-            <w:pPr>
-              <w:spacing w:after="35"/>
-            </w:pPr>
-            <w:r>
-              <w:rPr>
-                <w:sz w:val="19"/>
-              </w:rPr>
-              <w:t xml:space="preserve">Local regression checks passed; deployed retest and final tester sign-off pending.</w:t>
+              <w:t xml:space="preserve">Enabled SMTP verification-email delivery when no Brevo API key is configured, documented HTTPS email configuration, and preserved the earlier verification code when a resend fails. Login now issues a random tab-specific proof stored in sessionStorage, and protected APIs validate that proof together with the server session. Actual generic, student, and faculty login flows passed browser checks through dashboard navigation and refresh. Verification remains email-only; actual inbox delivery still requires deployment testing.</w:t>
+            </w:r>
+          </w:p>
+        </w:tc>
+        <w:tc>
+          <w:tcPr>
+            <w:tcW w:w="3800" w:type="dxa"/>
+          </w:tcPr>
+          <w:p>
+            <w:pPr>
+              <w:spacing w:after="35"/>
+            </w:pPr>
+            <w:r>
+              <w:rPr>
+                <w:sz w:val="19"/>
+              </w:rPr>
+              <w:t xml:space="preserve">Covered verification and login checks passed locally. Actual email receipt and deployed tester sign-off pending.</w:t>
             </w:r>
           </w:p>
         </w:tc>
@@ -799,23 +799,23 @@
               <w:rPr>
                 <w:sz w:val="19"/>
               </w:rPr>
-              <w:t xml:space="preserve">Reviewed login role filtering, role-specific session retrieval, page session guards, and faculty-only update checks. These paths identify the signed-in role and limit the corresponding protected operations. A local regression check confirmed that a student session cannot use the faculty-only booking-exclusion operation. The supplied tester status is OK; no new full login-and-role test cycle was performed.</w:t>
-            </w:r>
-          </w:p>
-        </w:tc>
-        <w:tc>
-          <w:tcPr>
-            <w:tcW w:w="3800" w:type="dxa"/>
-          </w:tcPr>
-          <w:p>
-            <w:pPr>
-              <w:spacing w:after="35"/>
-            </w:pPr>
-            <w:r>
-              <w:rPr>
-                <w:sz w:val="19"/>
-              </w:rPr>
-              <w:t xml:space="preserve">OK - existing tester result retained. One faculty-only restriction passed local verification; full role-access retest pending.</w:t>
+              <w:t xml:space="preserve">Added server-validated, role-bound tab login proofs and early guards on all 17 protected pages. A pasted portal URL in a fresh tab redirects to login, and protected content stays hidden until the session and role are verified. Tests confirmed rejection of cookie-only access, a forged proof, and a student proof used for a faculty session. Actual login, dashboard navigation, and refresh passed for all three login screens. Browser-controlled tab duplication can copy sessionStorage and is not claimed to be isolated.</w:t>
+            </w:r>
+          </w:p>
+        </w:tc>
+        <w:tc>
+          <w:tcPr>
+            <w:tcW w:w="3800" w:type="dxa"/>
+          </w:tcPr>
+          <w:p>
+            <w:pPr>
+              <w:spacing w:after="35"/>
+            </w:pPr>
+            <w:r>
+              <w:rPr>
+                <w:sz w:val="19"/>
+              </w:rPr>
+              <w:t xml:space="preserve">OK - existing tester result retained. Tab access and role restrictions passed local endpoint/browser checks; deployed confirmation pending.</w:t>
             </w:r>
           </w:p>
         </w:tc>
@@ -1334,23 +1334,23 @@
               <w:rPr>
                 <w:sz w:val="19"/>
               </w:rPr>
-              <w:t xml:space="preserve">Ran the 29-check regression suite covering verification email dispatch selection, OTP validation, faculty profile saving, student photo persistence, availability synchronization, rescheduling, booking conflicts, and student notification content. The suite included actual-page headless Chrome checks. All checks passed. This confirms the covered workflows; a complete deployed regression of every system function has not been recorded.</w:t>
-            </w:r>
-          </w:p>
-        </w:tc>
-        <w:tc>
-          <w:tcPr>
-            <w:tcW w:w="3800" w:type="dxa"/>
-          </w:tcPr>
-          <w:p>
-            <w:pPr>
-              <w:spacing w:after="35"/>
-            </w:pPr>
-            <w:r>
-              <w:rPr>
-                <w:sz w:val="19"/>
-              </w:rPr>
-              <w:t xml:space="preserve">Covered functionality passed 29 local regression checks. Complete deployed system-functionality testing and tester sign-off pending; original tester status was blank.</w:t>
+              <w:t xml:space="preserve">Ran the expanded 46-check regression suite covering verification dispatch, OTP validation, profile saving, photo persistence, availability synchronization, rescheduling, conflicts, notifications, tab-specific access checks, and logout revocation. Actual-page browser checks included all three login screens, dashboard navigation, and refresh. All 46 checks passed. These results cover the exercised workflows; a complete deployed test cycle for every function has not been recorded.</w:t>
+            </w:r>
+          </w:p>
+        </w:tc>
+        <w:tc>
+          <w:tcPr>
+            <w:tcW w:w="3800" w:type="dxa"/>
+          </w:tcPr>
+          <w:p>
+            <w:pPr>
+              <w:spacing w:after="35"/>
+            </w:pPr>
+            <w:r>
+              <w:rPr>
+                <w:sz w:val="19"/>
+              </w:rPr>
+              <w:t xml:space="preserve">Covered functionality passed 46 local regression checks. Complete deployed functionality testing and final tester sign-off pending.</w:t>
             </w:r>
           </w:p>
         </w:tc>
@@ -1731,23 +1731,23 @@
               <w:rPr>
                 <w:sz w:val="19"/>
               </w:rPr>
-              <w:t xml:space="preserve">Reviewed password verification, role-specific session checks, and ownership filters in the affected endpoints. Added authenticated access to database-stored photos and validated image size, type, and content before storage. Local tests confirmed rejection of an incorrect OTP, prevention of another student reading a private student photo, and rejection of a student attempting faculty-only schedule exclusion. This was targeted access testing, not a complete security audit.</w:t>
-            </w:r>
-          </w:p>
-        </w:tc>
-        <w:tc>
-          <w:tcPr>
-            <w:tcW w:w="3800" w:type="dxa"/>
-          </w:tcPr>
-          <w:p>
-            <w:pPr>
-              <w:spacing w:after="35"/>
-            </w:pPr>
-            <w:r>
-              <w:rPr>
-                <w:sz w:val="19"/>
-              </w:rPr>
-              <w:t xml:space="preserve">OK - existing tester result retained; targeted OTP and access-control checks passed locally. Full deployed security verification pending.</w:t>
+              <w:t xml:space="preserve">Required both the server session and a random role/user-bound tab proof for protected API access. Kept proofs out of URLs and localStorage, hid protected pages until verification, and fetched private photos with authenticated headers for display as blob URLs. Local checks rejected cookie-only requests, forged proofs, cross-role access, and unauthorized student-photo access. Tests also confirmed that logout revokes the proof and that a fresh tab cannot log out another tab using cookies alone. This was targeted testing, not a complete security audit.</w:t>
+            </w:r>
+          </w:p>
+        </w:tc>
+        <w:tc>
+          <w:tcPr>
+            <w:tcW w:w="3800" w:type="dxa"/>
+          </w:tcPr>
+          <w:p>
+            <w:pPr>
+              <w:spacing w:after="35"/>
+            </w:pPr>
+            <w:r>
+              <w:rPr>
+                <w:sz w:val="19"/>
+              </w:rPr>
+              <w:t xml:space="preserve">OK - existing tester result retained. Targeted tab access, role restrictions, private-photo access, and logout checks passed locally; deployed security review pending.</w:t>
             </w:r>
           </w:p>
         </w:tc>
@@ -1800,23 +1800,23 @@
               <w:rPr>
                 <w:sz w:val="19"/>
               </w:rPr>
-              <w:t xml:space="preserve">Reviewed viewport settings and responsive styles used by the portal pages. Ran actual-page checks in headless Chrome for faculty profile, student profile, availability, and rescheduling; all covered interactions passed. The supplied tester status is OK. No new Firefox, Safari, Edge, mobile-device, or screen-size matrix was executed.</w:t>
-            </w:r>
-          </w:p>
-        </w:tc>
-        <w:tc>
-          <w:tcPr>
-            <w:tcW w:w="3800" w:type="dxa"/>
-          </w:tcPr>
-          <w:p>
-            <w:pPr>
-              <w:spacing w:after="35"/>
-            </w:pPr>
-            <w:r>
-              <w:rPr>
-                <w:sz w:val="19"/>
-              </w:rPr>
-              <w:t xml:space="preserve">OK - existing tester result retained; covered Chrome interactions passed. Broader browser and device compatibility retesting pending.</w:t>
+              <w:t xml:space="preserve">Reviewed portal viewport settings and responsive styles. Actual-page checks passed in headless Chrome for faculty profile, student profile, availability, and rescheduling. Additional real-time browser checks passed for generic, student, and faculty login through dashboard navigation and refresh. Existing tester status OK is retained. No new Firefox, Safari, Edge, mobile-device, or screen-size matrix was executed.</w:t>
+            </w:r>
+          </w:p>
+        </w:tc>
+        <w:tc>
+          <w:tcPr>
+            <w:tcW w:w="3800" w:type="dxa"/>
+          </w:tcPr>
+          <w:p>
+            <w:pPr>
+              <w:spacing w:after="35"/>
+            </w:pPr>
+            <w:r>
+              <w:rPr>
+                <w:sz w:val="19"/>
+              </w:rPr>
+              <w:t xml:space="preserve">OK - existing tester result retained; covered Chrome interactions passed. Broader browser/device compatibility retesting pending.</w:t>
             </w:r>
           </w:p>
         </w:tc>
@@ -2010,7 +2010,7 @@
         <w:rPr>
           <w:sz w:val="20"/>
         </w:rPr>
-        <w:t xml:space="preserve">Implementation commit: 90e44dc. All 29 local regression checks passed during the system-fix task. Run python tests/run_regressions.py to repeat the suite. See tests/README.md for the isolated fixture limitations and deployment mail settings.</w:t>
+        <w:t xml:space="preserve">Implementation commits: 90e44dc (reported fixes) and 5adcbff (tab-specific access protection). All 46 local regression checks passed during the system-fix task. Run python tests/run_regressions.py to repeat the suite. See tests/README.md for the isolated fixture limitations and deployment mail settings.</w:t>
       </w:r>
     </w:p>
     <w:sectPr>

</xml_diff>